<commit_message>
Reformat manuscript and DOCX files for Research Synthesis Methods journal
- Change 'Background' section to 'Introduction' (English: Introduction, Japanese: 序論)
- Restructure abstract to RSM format: Aim(s), Background, Methods, Results, Conclusions
- Add Running head, ORCID placeholder, and Research Synthesis Keywords
- Update declarations to RSM requirements: Data Availability Statement, CRediT Taxonomy
- Expand references from 17 to 20 (add Cochrane Handbook, Schild, Peters, Doi)
- Update all in-text citation numbers to match new reference list
- Add cover letter for Research Synthesis Methods

Co-Authored-By: Tatsuki Onishi <bougtoir@gmail.com>
</commit_message>
<xml_diff>
--- a/icr_paper/ICR_paper_english.docx
+++ b/icr_paper/ICR_paper_english.docx
@@ -55,10 +55,38 @@
         <w:rPr>
           <w:rFonts w:ascii="Times New Roman" w:hAnsi="Times New Roman"/>
           <w:b w:val="0"/>
+          <w:i/>
+          <w:sz w:val="24"/>
+        </w:rPr>
+        <w:t>Running head: LINKO: Information Contribution Ratio for Meta-Analysis Validity</w:t>
+      </w:r>
+    </w:p>
+    <w:p>
+      <w:pPr>
+        <w:spacing w:line="480" w:lineRule="auto"/>
+      </w:pPr>
+      <w:r>
+        <w:rPr>
+          <w:rFonts w:ascii="Times New Roman" w:hAnsi="Times New Roman"/>
+          <w:b w:val="0"/>
           <w:i w:val="0"/>
           <w:sz w:val="24"/>
         </w:rPr>
-        <w:t>[Author names]</w:t>
+      </w:r>
+    </w:p>
+    <w:p>
+      <w:pPr>
+        <w:spacing w:line="480" w:lineRule="auto"/>
+        <w:jc w:val="center"/>
+      </w:pPr>
+      <w:r>
+        <w:rPr>
+          <w:rFonts w:ascii="Times New Roman" w:hAnsi="Times New Roman"/>
+          <w:b w:val="0"/>
+          <w:i w:val="0"/>
+          <w:sz w:val="24"/>
+        </w:rPr>
+        <w:t>Tatsuki Onishi [ORCID: https://orcid.org/XXXX-XXXX-XXXX-XXXX]</w:t>
       </w:r>
     </w:p>
     <w:p>
@@ -101,7 +129,7 @@
           <w:i w:val="0"/>
           <w:sz w:val="24"/>
         </w:rPr>
-        <w:t>Corresponding author: [Name, Email]</w:t>
+        <w:t>Corresponding author: Tatsuki Onishi, [Email], ORCID: https://orcid.org/XXXX-XXXX-XXXX-XXXX</w:t>
       </w:r>
     </w:p>
     <w:p>
@@ -119,6 +147,26 @@
           <w:color w:val="000000"/>
         </w:rPr>
         <w:t>Abstract</w:t>
+      </w:r>
+    </w:p>
+    <w:p>
+      <w:pPr>
+        <w:spacing w:line="480" w:lineRule="auto"/>
+      </w:pPr>
+      <w:r>
+        <w:rPr>
+          <w:rFonts w:ascii="Times New Roman" w:hAnsi="Times New Roman"/>
+          <w:b/>
+          <w:sz w:val="24"/>
+        </w:rPr>
+        <w:t xml:space="preserve">Aim(s): </w:t>
+      </w:r>
+      <w:r>
+        <w:rPr>
+          <w:rFonts w:ascii="Times New Roman" w:hAnsi="Times New Roman"/>
+          <w:sz w:val="24"/>
+        </w:rPr>
+        <w:t>We introduce the LINKO (Latent Information Normalization for Key Outcomes) framework, which proposes the Information Contribution Ratio (ICR) as a novel diagnostic measure for assessing whether endpoint variables carry equivalent informational weight across studies entering a meta-analysis.</w:t>
       </w:r>
     </w:p>
     <w:p>
@@ -138,7 +186,7 @@
           <w:rFonts w:ascii="Times New Roman" w:hAnsi="Times New Roman"/>
           <w:sz w:val="24"/>
         </w:rPr>
-        <w:t>Meta-analysis pools endpoint-level results from multiple randomized controlled trials (RCTs) to produce synthesized evidence. However, each RCT collects a different number and type of variables, meaning the endpoint may represent vastly different proportions of the total information space across studies. No existing framework quantifies this structural heterogeneity.</w:t>
+        <w:t>Meta-analysis pools endpoint-level effect sizes from multiple randomized controlled trials (RCTs). However, each RCT collects a different number of variables, meaning the endpoint may represent vastly different proportions of the total information space across studies. This structural heterogeneity is not captured by existing measures such as I-squared or tau-squared.</w:t>
       </w:r>
     </w:p>
     <w:p>
@@ -158,7 +206,7 @@
           <w:rFonts w:ascii="Times New Roman" w:hAnsi="Times New Roman"/>
           <w:sz w:val="24"/>
         </w:rPr>
-        <w:t>We propose the LINKO (Latent Information Normalization for Key Outcomes) framework, centered on the Information Contribution Ratio (ICR), defined as the proportion of total data information attributable to the endpoint. Two approaches are developed: (1) a variance-based approach (ICR_v) computable from published Table 1 summary statistics, and (2) a PCA-based approach (ICR_pca) using individual patient data. We also introduce the Prism Forest Plot, a novel visualization encoding ICR as color and size dimensions. We validate the framework through Monte Carlo simulation (100 iterations x 3 scenarios), analysis of two real-world meta-analysis domains (statin therapy, intensive glucose control), PCA-based validation using the International Stroke Trial (IST) dataset (19,435 patients, 25 variables, 8 country sub-studies), and an early convergence analysis (500 iterations). Leave-one-out sensitivity analysis assessed robustness. The simulation study is reported following the ADEMP framework.</w:t>
+        <w:t>We define ICR as the proportion of a study's total data information attributable to its endpoint. Two complementary approaches are developed: (1) a variance-based approach (ICR_std = d/D) computable from published Table 1 summary statistics, and (2) a PCA-based approach (ICR_pca) using individual patient data (IPD). We also introduce the Prism Forest Plot, a novel visualization encoding ICR as color and point-size dimensions. The framework is validated through Monte Carlo simulation (100 iterations x 3 scenarios, reported following the ADEMP framework), analysis of two real-world meta-analysis domains (statin therapy, intensive glucose control), PCA-based validation using the International Stroke Trial (IST) dataset (19,435 patients, 25 variables, 8 country sub-studies), leave-one-out sensitivity analysis, and an early convergence simulation (500 iterations).</w:t>
       </w:r>
     </w:p>
     <w:p>
@@ -178,7 +226,7 @@
           <w:rFonts w:ascii="Times New Roman" w:hAnsi="Times New Roman"/>
           <w:sz w:val="24"/>
         </w:rPr>
-        <w:t>In simulations, studies with heterogeneous ICR showed higher mean I-squared (11.7%) than those with uniform ICR (11.0%). In real-world data, the stable statin meta-analysis had low ICR discrepancy (ICRD = 0.009, I-squared = 0.0%), while the heterogeneous glucose control meta-analysis showed higher ICRD (0.048, I-squared = 17.0%). The Prism Forest Plot visually revealed these differences: uniform colors for statins vs. a clear color gradient for glucose control. PCA-based ICR analysis of the IST dataset revealed that the endpoint's informational weight varied substantially across country sub-studies (ICR_pca loading: 0.046-0.180, CV = 0.36). The regression-based ICR_pca correlated strongly with 14-day mortality (r = 0.90, p = 0.003), and this association was robust in leave-one-out analysis (r = 0.84-0.95, all p &lt; 0.02). Early convergence simulation showed that LINKO-optimized study selection achieved the lowest mean studies to I-squared &lt; 25% (3.14 vs 3.19-3.20 for other strategies).</w:t>
+        <w:t>In simulation, studies with heterogeneous ICR showed higher mean I-squared (11.7%) than those with uniform ICR (11.0%). In real-world data, a stable meta-analysis (statin therapy) had low ICR discrepancy (ICRD = 0.009, I-squared = 0.0%), while a heterogeneous meta-analysis (glucose control) showed higher ICRD (0.048, I-squared = 17.0%). PCA-based ICR varied 4-fold across IST country sub-studies (ICR_pca loading: 0.046-0.180, CV = 0.36), and regression-based ICR_pca correlated strongly with 14-day mortality (r = 0.90, p = 0.003), robust across leave-one-out analysis (r = 0.84-0.95, all p &lt; 0.02). The Prism Forest Plot visually revealed structural heterogeneity invisible in standard forest plots.</w:t>
       </w:r>
     </w:p>
     <w:p>
@@ -198,7 +246,7 @@
           <w:rFonts w:ascii="Times New Roman" w:hAnsi="Times New Roman"/>
           <w:sz w:val="24"/>
         </w:rPr>
-        <w:t>LINKO provides a novel, computable diagnostic framework for assessing whether endpoint variables carry equivalent informational weight across studies in a meta-analysis. The Prism Forest Plot enables immediate visual assessment of structural heterogeneity. ICR discrepancy should be reported alongside standard heterogeneity measures (I-squared, tau-squared) to improve transparency in evidence synthesis.</w:t>
+        <w:t>LINKO provides a computable diagnostic framework for assessing structural comparability of studies in a meta-analysis. We recommend reporting ICR discrepancy alongside I-squared and tau-squared to improve transparency in evidence synthesis.</w:t>
       </w:r>
     </w:p>
     <w:p>
@@ -218,7 +266,27 @@
           <w:rFonts w:ascii="Times New Roman" w:hAnsi="Times New Roman"/>
           <w:sz w:val="24"/>
         </w:rPr>
-        <w:t>LINKO, meta-analysis, heterogeneity, information contribution ratio, Prism Forest Plot, randomized controlled trial, evidence synthesis, principal component analysis, individual patient data</w:t>
+        <w:t>meta-analysis, heterogeneity, information contribution ratio, evidence synthesis, principal component analysis, individual patient data, forest plot</w:t>
+      </w:r>
+    </w:p>
+    <w:p>
+      <w:pPr>
+        <w:spacing w:line="480" w:lineRule="auto"/>
+      </w:pPr>
+      <w:r>
+        <w:rPr>
+          <w:rFonts w:ascii="Times New Roman" w:hAnsi="Times New Roman"/>
+          <w:b/>
+          <w:sz w:val="24"/>
+        </w:rPr>
+        <w:t xml:space="preserve">Research Synthesis Keywords: </w:t>
+      </w:r>
+      <w:r>
+        <w:rPr>
+          <w:rFonts w:ascii="Times New Roman" w:hAnsi="Times New Roman"/>
+          <w:sz w:val="24"/>
+        </w:rPr>
+        <w:t>meta-analysis heterogeneity diagnostics; structural heterogeneity; individual participant data synthesis; novel visualization methods; simulation study</w:t>
       </w:r>
     </w:p>
     <w:p>
@@ -235,7 +303,7 @@
           <w:rFonts w:ascii="Times New Roman" w:hAnsi="Times New Roman"/>
           <w:color w:val="000000"/>
         </w:rPr>
-        <w:t>Background</w:t>
+        <w:t>Introduction</w:t>
       </w:r>
     </w:p>
     <w:p>
@@ -723,7 +791,7 @@
           <w:i w:val="0"/>
           <w:sz w:val="24"/>
         </w:rPr>
-        <w:t>We report the simulation study following the ADEMP framework [2,3] for transparent reporting of simulation studies evaluating statistical methods.</w:t>
+        <w:t>We report the simulation study following the ADEMP framework [3,4] for transparent reporting of simulation studies evaluating statistical methods.</w:t>
       </w:r>
     </w:p>
     <w:p>
@@ -924,7 +992,7 @@
           <w:rFonts w:ascii="Times New Roman" w:hAnsi="Times New Roman"/>
           <w:sz w:val="24"/>
         </w:rPr>
-        <w:t>DerSimonian-Laird random-effects meta-analysis [4]. For Scenario C, sequential (cumulative) meta-analysis.</w:t>
+        <w:t>DerSimonian-Laird random-effects meta-analysis [5]. For Scenario C, sequential (cumulative) meta-analysis.</w:t>
       </w:r>
     </w:p>
     <w:p>
@@ -1016,7 +1084,7 @@
           <w:rFonts w:ascii="Times New Roman" w:hAnsi="Times New Roman"/>
           <w:sz w:val="24"/>
         </w:rPr>
-        <w:t>Five landmark RCTs (4S, WOSCOPS, CARE, LIPID, AFCAPS/TexCAPS) [5-9] with consistent mortality benefit. Similar variable sets (D = 10-11).</w:t>
+        <w:t>Five landmark RCTs (4S, WOSCOPS, CARE, LIPID, AFCAPS/TexCAPS) [6-10] with consistent mortality benefit. Similar variable sets (D = 10-11).</w:t>
       </w:r>
     </w:p>
     <w:p>
@@ -1049,7 +1117,7 @@
           <w:rFonts w:ascii="Times New Roman" w:hAnsi="Times New Roman"/>
           <w:sz w:val="24"/>
         </w:rPr>
-        <w:t>Four major RCTs (UKPDS 33, ACCORD, ADVANCE, VADT) [10-13] where heterogeneity emerged. Different variable counts (D = 8-13).</w:t>
+        <w:t>Four major RCTs (UKPDS 33, ACCORD, ADVANCE, VADT) [11-14] where heterogeneity emerged. Different variable counts (D = 8-13).</w:t>
       </w:r>
     </w:p>
     <w:p>
@@ -1075,7 +1143,7 @@
           <w:i w:val="0"/>
           <w:sz w:val="24"/>
         </w:rPr>
-        <w:t>We used the International Stroke Trial (IST) dataset [14,15], comprising 19,435 patients across 36 countries. We encoded 25 analysis variables and treated the 8 largest country cohorts (UK, Italy, Switzerland, Poland, Netherlands, Sweden, Australia, Argentina; n = 545-5,787) as independent "sub-studies." Leave-one-out sensitivity analysis assessed robustness by iteratively excluding each country.</w:t>
+        <w:t>We used the International Stroke Trial (IST) dataset [15,16], comprising 19,435 patients across 36 countries. We encoded 25 analysis variables and treated the 8 largest country cohorts (UK, Italy, Switzerland, Poland, Netherlands, Sweden, Australia, Argentina; n = 545-5,787) as independent "sub-studies." Leave-one-out sensitivity analysis assessed robustness by iteratively excluding each country.</w:t>
       </w:r>
     </w:p>
     <w:p>
@@ -5731,7 +5799,7 @@
           <w:i w:val="0"/>
           <w:sz w:val="24"/>
         </w:rPr>
-        <w:t>Standard sources of meta-analysis heterogeneity include clinical diversity, methodological diversity, and statistical heterogeneity [1]. LINKO introduces a fourth source: structural diversity in data dimensionality. This has parallels in high-dimensional statistics [16] but has not previously been applied to meta-analysis. The Prism Forest Plot extends the growing family of enhanced forest plots (e.g., rain forest plots, contour-enhanced funnel plots) by adding the ICR dimension.</w:t>
+        <w:t>Standard sources of meta-analysis heterogeneity include clinical diversity, methodological diversity, and statistical heterogeneity [2]. LINKO introduces a fourth source: structural diversity in data dimensionality. This has parallels in high-dimensional statistics [17] but has not previously been applied to meta-analysis. The Prism Forest Plot extends the growing family of enhanced forest plots (e.g., rain forest plots, contour-enhanced funnel plots) by adding the ICR dimension.</w:t>
       </w:r>
     </w:p>
     <w:p>
@@ -5948,7 +6016,7 @@
           <w:rFonts w:ascii="Times New Roman" w:hAnsi="Times New Roman"/>
           <w:color w:val="000000"/>
         </w:rPr>
-        <w:t>Availability of data and materials</w:t>
+        <w:t>Data Availability Statement</w:t>
       </w:r>
     </w:p>
     <w:p>
@@ -5962,7 +6030,7 @@
           <w:i w:val="0"/>
           <w:sz w:val="24"/>
         </w:rPr>
-        <w:t>The IST dataset is publicly available from the University of Edinburgh. All code: https://github.com/bougtoir/wip/tree/devin/1774353301-icr-paper/icr_paper</w:t>
+        <w:t>The IST dataset is publicly available from the University of Edinburgh (https://datashare.ed.ac.uk/handle/10283/128). All analysis code is available at: https://github.com/bougtoir/wip/tree/devin/1774353301-icr-paper/icr_paper</w:t>
       </w:r>
     </w:p>
     <w:p>
@@ -5974,7 +6042,7 @@
           <w:rFonts w:ascii="Times New Roman" w:hAnsi="Times New Roman"/>
           <w:color w:val="000000"/>
         </w:rPr>
-        <w:t>Competing interests</w:t>
+        <w:t>Competing Interests</w:t>
       </w:r>
     </w:p>
     <w:p>
@@ -6026,7 +6094,7 @@
           <w:rFonts w:ascii="Times New Roman" w:hAnsi="Times New Roman"/>
           <w:color w:val="000000"/>
         </w:rPr>
-        <w:t>Authors' contributions</w:t>
+        <w:t>Authors' Contributions (CRediT Taxonomy)</w:t>
       </w:r>
     </w:p>
     <w:p>
@@ -6040,7 +6108,7 @@
           <w:i w:val="0"/>
           <w:sz w:val="24"/>
         </w:rPr>
-        <w:t>[To be completed]</w:t>
+        <w:t>[To be completed. Example: Conceptualization: T.O.; Methodology: T.O.; Software: T.O.; Formal analysis: T.O.; Writing - original draft: T.O.; Writing - review &amp; editing: T.O.]</w:t>
       </w:r>
     </w:p>
     <w:p>
@@ -6111,7 +6179,7 @@
           <w:i w:val="0"/>
           <w:sz w:val="24"/>
         </w:rPr>
-        <w:t>2. Morris TP, White IR, Crowther MJ. Using simulation studies to evaluate statistical methods. Stat Med. 2019;38(11):2074-2102.</w:t>
+        <w:t>2. Higgins JPT, Thomas J, Chandler J, et al. Cochrane Handbook for Systematic Reviews of Interventions. Version 6.3. Cochrane; 2022.</w:t>
       </w:r>
     </w:p>
     <w:p>
@@ -6125,7 +6193,7 @@
           <w:i w:val="0"/>
           <w:sz w:val="24"/>
         </w:rPr>
-        <w:t>3. Siepe BS, Bartos F, Morris TP, et al. Simulation studies for methodological research in psychology. Psychol Methods. 2024.</w:t>
+        <w:t>3. Morris TP, White IR, Crowther MJ. Using simulation studies to evaluate statistical methods. Stat Med. 2019;38(11):2074-2102.</w:t>
       </w:r>
     </w:p>
     <w:p>
@@ -6139,7 +6207,7 @@
           <w:i w:val="0"/>
           <w:sz w:val="24"/>
         </w:rPr>
-        <w:t>4. DerSimonian R, Laird N. Meta-analysis in clinical trials. Control Clin Trials. 1986;7(3):177-188.</w:t>
+        <w:t>4. Siepe BS, Bartos F, Morris TP, et al. Simulation studies for methodological research in psychology. Psychol Methods. 2024.</w:t>
       </w:r>
     </w:p>
     <w:p>
@@ -6153,7 +6221,7 @@
           <w:i w:val="0"/>
           <w:sz w:val="24"/>
         </w:rPr>
-        <w:t>5. Scandinavian Simvastatin Survival Study Group. Randomised trial of cholesterol lowering in 4444 patients (4S). Lancet. 1994;344:1383-1389.</w:t>
+        <w:t>5. DerSimonian R, Laird N. Meta-analysis in clinical trials. Control Clin Trials. 1986;7(3):177-188.</w:t>
       </w:r>
     </w:p>
     <w:p>
@@ -6167,7 +6235,7 @@
           <w:i w:val="0"/>
           <w:sz w:val="24"/>
         </w:rPr>
-        <w:t>6. Shepherd J, et al. Prevention of coronary heart disease with pravastatin (WOSCOPS). N Engl J Med. 1995;333:1301-1307.</w:t>
+        <w:t>6. Scandinavian Simvastatin Survival Study Group. Randomised trial of cholesterol lowering in 4444 patients (4S). Lancet. 1994;344:1383-1389.</w:t>
       </w:r>
     </w:p>
     <w:p>
@@ -6181,7 +6249,7 @@
           <w:i w:val="0"/>
           <w:sz w:val="24"/>
         </w:rPr>
-        <w:t>7. Sacks FM, et al. Effect of pravastatin on coronary events after MI (CARE). N Engl J Med. 1996;335:1001-1009.</w:t>
+        <w:t>7. Shepherd J, et al. Prevention of coronary heart disease with pravastatin (WOSCOPS). N Engl J Med. 1995;333:1301-1307.</w:t>
       </w:r>
     </w:p>
     <w:p>
@@ -6195,7 +6263,7 @@
           <w:i w:val="0"/>
           <w:sz w:val="24"/>
         </w:rPr>
-        <w:t>8. LIPID Study Group. Prevention of cardiovascular events with pravastatin (LIPID). N Engl J Med. 1998;339:1349-1357.</w:t>
+        <w:t>8. Sacks FM, et al. Effect of pravastatin on coronary events after MI (CARE). N Engl J Med. 1996;335:1001-1009.</w:t>
       </w:r>
     </w:p>
     <w:p>
@@ -6209,7 +6277,7 @@
           <w:i w:val="0"/>
           <w:sz w:val="24"/>
         </w:rPr>
-        <w:t>9. Downs JR, et al. Primary prevention of acute coronary events with lovastatin (AFCAPS/TexCAPS). JAMA. 1998;279:1615-1622.</w:t>
+        <w:t>9. LIPID Study Group. Prevention of cardiovascular events with pravastatin (LIPID). N Engl J Med. 1998;339:1349-1357.</w:t>
       </w:r>
     </w:p>
     <w:p>
@@ -6223,7 +6291,7 @@
           <w:i w:val="0"/>
           <w:sz w:val="24"/>
         </w:rPr>
-        <w:t>10. UKPDS Group. Intensive blood-glucose control (UKPDS 33). Lancet. 1998;352:837-853.</w:t>
+        <w:t>10. Downs JR, et al. Primary prevention of acute coronary events with lovastatin (AFCAPS/TexCAPS). JAMA. 1998;279:1615-1622.</w:t>
       </w:r>
     </w:p>
     <w:p>
@@ -6237,7 +6305,7 @@
           <w:i w:val="0"/>
           <w:sz w:val="24"/>
         </w:rPr>
-        <w:t>11. ACCORD Study Group. Effects of intensive glucose lowering in type 2 diabetes. N Engl J Med. 2008;358:2545-2559.</w:t>
+        <w:t>11. UKPDS Group. Intensive blood-glucose control (UKPDS 33). Lancet. 1998;352:837-853.</w:t>
       </w:r>
     </w:p>
     <w:p>
@@ -6251,7 +6319,7 @@
           <w:i w:val="0"/>
           <w:sz w:val="24"/>
         </w:rPr>
-        <w:t>12. ADVANCE Collaborative Group. Intensive blood glucose control (ADVANCE). N Engl J Med. 2008;358:2560-2572.</w:t>
+        <w:t>12. ACCORD Study Group. Effects of intensive glucose lowering in type 2 diabetes. N Engl J Med. 2008;358:2545-2559.</w:t>
       </w:r>
     </w:p>
     <w:p>
@@ -6265,7 +6333,7 @@
           <w:i w:val="0"/>
           <w:sz w:val="24"/>
         </w:rPr>
-        <w:t>13. Duckworth W, et al. Glucose control and vascular complications in veterans (VADT). N Engl J Med. 2009;360:129-139.</w:t>
+        <w:t>13. ADVANCE Collaborative Group. Intensive blood glucose control (ADVANCE). N Engl J Med. 2008;358:2560-2572.</w:t>
       </w:r>
     </w:p>
     <w:p>
@@ -6279,7 +6347,7 @@
           <w:i w:val="0"/>
           <w:sz w:val="24"/>
         </w:rPr>
-        <w:t>14. International Stroke Trial Collaborative Group. The IST. Lancet. 1997;349:1569-1581.</w:t>
+        <w:t>14. Duckworth W, et al. Glucose control and vascular complications in veterans (VADT). N Engl J Med. 2009;360:129-139.</w:t>
       </w:r>
     </w:p>
     <w:p>
@@ -6293,7 +6361,7 @@
           <w:i w:val="0"/>
           <w:sz w:val="24"/>
         </w:rPr>
-        <w:t>15. Sandercock PAG, et al. The IST database. Trials. 2011;12:101.</w:t>
+        <w:t>15. International Stroke Trial Collaborative Group. The IST. Lancet. 1997;349:1569-1581.</w:t>
       </w:r>
     </w:p>
     <w:p>
@@ -6307,7 +6375,7 @@
           <w:i w:val="0"/>
           <w:sz w:val="24"/>
         </w:rPr>
-        <w:t>16. Donoho DL. High-dimensional data analysis: curses and blessings of dimensionality. AMS Math Challenges Lecture. 2000:1-32.</w:t>
+        <w:t>16. Sandercock PAG, et al. The IST database. Trials. 2011;12:101.</w:t>
       </w:r>
     </w:p>
     <w:p>
@@ -6321,7 +6389,49 @@
           <w:i w:val="0"/>
           <w:sz w:val="24"/>
         </w:rPr>
-        <w:t>17. Riley RD, Lambert PC, Abo-Zaid G. Meta-analysis of individual participant data. BMJ. 2010;340:c221.</w:t>
+        <w:t>17. Donoho DL. High-dimensional data analysis: curses and blessings of dimensionality. AMS Math Challenges Lecture. 2000:1-32.</w:t>
+      </w:r>
+    </w:p>
+    <w:p>
+      <w:pPr>
+        <w:spacing w:line="480" w:lineRule="auto"/>
+      </w:pPr>
+      <w:r>
+        <w:rPr>
+          <w:rFonts w:ascii="Times New Roman" w:hAnsi="Times New Roman"/>
+          <w:b w:val="0"/>
+          <w:i w:val="0"/>
+          <w:sz w:val="24"/>
+        </w:rPr>
+        <w:t>18. Schild AHE, Voracek M. Less is less: a systematic review of graph use in meta-analyses. Res Synth Methods. 2013;4(3):209-219.</w:t>
+      </w:r>
+    </w:p>
+    <w:p>
+      <w:pPr>
+        <w:spacing w:line="480" w:lineRule="auto"/>
+      </w:pPr>
+      <w:r>
+        <w:rPr>
+          <w:rFonts w:ascii="Times New Roman" w:hAnsi="Times New Roman"/>
+          <w:b w:val="0"/>
+          <w:i w:val="0"/>
+          <w:sz w:val="24"/>
+        </w:rPr>
+        <w:t>19. Peters JL, Sutton AJ, Jones DR, Abrams KR, Rushton L. Contour-enhanced meta-analysis funnel plots. J Clin Epidemiol. 2008;61(10):991-996.</w:t>
+      </w:r>
+    </w:p>
+    <w:p>
+      <w:pPr>
+        <w:spacing w:line="480" w:lineRule="auto"/>
+      </w:pPr>
+      <w:r>
+        <w:rPr>
+          <w:rFonts w:ascii="Times New Roman" w:hAnsi="Times New Roman"/>
+          <w:b w:val="0"/>
+          <w:i w:val="0"/>
+          <w:sz w:val="24"/>
+        </w:rPr>
+        <w:t>20. Doi SAR, Barendregt JJ, Khan S, et al. Advances in the meta-analysis of heterogeneous clinical trials I. Contemp Clin Trials. 2015;45:130-138.</w:t>
       </w:r>
     </w:p>
     <w:sectPr>

</xml_diff>

<commit_message>
Shorten abstract to <=250 words and add RSM highlight sections
- Abstract reduced from 334 to 240 words (RSM limit: 250)
- Added 'What is already known' section (English + Japanese)
- Added 'What is new' section (English + Japanese)
- Added 'Potential impact for RSM readers outside the authors' field' section (English + Japanese)
- Both DOCX files regenerated with updated content

Co-Authored-By: Tatsuki Onishi <bougtoir@gmail.com>
</commit_message>
<xml_diff>
--- a/icr_paper/ICR_paper_english.docx
+++ b/icr_paper/ICR_paper_english.docx
@@ -166,7 +166,7 @@
           <w:rFonts w:ascii="Times New Roman" w:hAnsi="Times New Roman"/>
           <w:sz w:val="24"/>
         </w:rPr>
-        <w:t>We introduce the LINKO (Latent Information Normalization for Key Outcomes) framework, which proposes the Information Contribution Ratio (ICR) as a novel diagnostic measure for assessing whether endpoint variables carry equivalent informational weight across studies entering a meta-analysis.</w:t>
+        <w:t>We introduce the LINKO (Latent Information Normalization for Key Outcomes) framework, proposing the Information Contribution Ratio (ICR) as a diagnostic measure for assessing whether endpoint variables carry equivalent informational weight across studies in a meta-analysis.</w:t>
       </w:r>
     </w:p>
     <w:p>
@@ -186,7 +186,7 @@
           <w:rFonts w:ascii="Times New Roman" w:hAnsi="Times New Roman"/>
           <w:sz w:val="24"/>
         </w:rPr>
-        <w:t>Meta-analysis pools endpoint-level effect sizes from multiple randomized controlled trials (RCTs). However, each RCT collects a different number of variables, meaning the endpoint may represent vastly different proportions of the total information space across studies. This structural heterogeneity is not captured by existing measures such as I-squared or tau-squared.</w:t>
+        <w:t>Meta-analysis pools effect sizes from multiple RCTs, but each RCT collects different numbers of variables, meaning the endpoint may represent vastly different proportions of the total information space. This structural heterogeneity is not captured by I-squared or tau-squared.</w:t>
       </w:r>
     </w:p>
     <w:p>
@@ -206,7 +206,7 @@
           <w:rFonts w:ascii="Times New Roman" w:hAnsi="Times New Roman"/>
           <w:sz w:val="24"/>
         </w:rPr>
-        <w:t>We define ICR as the proportion of a study's total data information attributable to its endpoint. Two complementary approaches are developed: (1) a variance-based approach (ICR_std = d/D) computable from published Table 1 summary statistics, and (2) a PCA-based approach (ICR_pca) using individual patient data (IPD). We also introduce the Prism Forest Plot, a novel visualization encoding ICR as color and point-size dimensions. The framework is validated through Monte Carlo simulation (100 iterations x 3 scenarios, reported following the ADEMP framework), analysis of two real-world meta-analysis domains (statin therapy, intensive glucose control), PCA-based validation using the International Stroke Trial (IST) dataset (19,435 patients, 25 variables, 8 country sub-studies), leave-one-out sensitivity analysis, and an early convergence simulation (500 iterations).</w:t>
+        <w:t>We define ICR as the proportion of a study's total data information attributable to its endpoint. Two approaches are developed: (1) a variance-based approach (ICR_std = d/D) computable from published Table 1 statistics, and (2) a PCA-based approach (ICR_pca) using individual patient data. We introduce the Prism Forest Plot encoding ICR as color and size dimensions. Validation includes Monte Carlo simulation (ADEMP framework), two real-world domains, PCA validation using the IST dataset (19,435 patients, 8 country sub-studies), and leave-one-out sensitivity analysis.</w:t>
       </w:r>
     </w:p>
     <w:p>
@@ -226,7 +226,7 @@
           <w:rFonts w:ascii="Times New Roman" w:hAnsi="Times New Roman"/>
           <w:sz w:val="24"/>
         </w:rPr>
-        <w:t>In simulation, studies with heterogeneous ICR showed higher mean I-squared (11.7%) than those with uniform ICR (11.0%). In real-world data, a stable meta-analysis (statin therapy) had low ICR discrepancy (ICRD = 0.009, I-squared = 0.0%), while a heterogeneous meta-analysis (glucose control) showed higher ICRD (0.048, I-squared = 17.0%). PCA-based ICR varied 4-fold across IST country sub-studies (ICR_pca loading: 0.046-0.180, CV = 0.36), and regression-based ICR_pca correlated strongly with 14-day mortality (r = 0.90, p = 0.003), robust across leave-one-out analysis (r = 0.84-0.95, all p &lt; 0.02). The Prism Forest Plot visually revealed structural heterogeneity invisible in standard forest plots.</w:t>
+        <w:t>In simulation, heterogeneous ICR yielded higher I-squared (11.7% vs 11.0%). In real-world data, statin therapy (low ICRD = 0.009) showed I-squared = 0.0%, while glucose control (ICRD = 0.048) showed I-squared = 17.0%. PCA-based ICR varied 4-fold across IST sub-studies (CV = 0.36); regression-based ICR_pca correlated with 14-day mortality (r = 0.90, p = 0.003), robust in leave-one-out analysis (r = 0.84-0.95, all p &lt; 0.02).</w:t>
       </w:r>
     </w:p>
     <w:p>
@@ -246,7 +246,7 @@
           <w:rFonts w:ascii="Times New Roman" w:hAnsi="Times New Roman"/>
           <w:sz w:val="24"/>
         </w:rPr>
-        <w:t>LINKO provides a computable diagnostic framework for assessing structural comparability of studies in a meta-analysis. We recommend reporting ICR discrepancy alongside I-squared and tau-squared to improve transparency in evidence synthesis.</w:t>
+        <w:t>LINKO provides a computable diagnostic for assessing structural comparability in meta-analysis. We recommend reporting ICR discrepancy alongside I-squared and tau-squared.</w:t>
       </w:r>
     </w:p>
     <w:p>
@@ -287,6 +287,199 @@
           <w:sz w:val="24"/>
         </w:rPr>
         <w:t>meta-analysis heterogeneity diagnostics; structural heterogeneity; individual participant data synthesis; novel visualization methods; simulation study</w:t>
+      </w:r>
+    </w:p>
+    <w:p>
+      <w:r>
+        <w:br w:type="page"/>
+      </w:r>
+    </w:p>
+    <w:p>
+      <w:pPr>
+        <w:pStyle w:val="Heading2"/>
+      </w:pPr>
+      <w:r>
+        <w:rPr>
+          <w:rFonts w:ascii="Times New Roman" w:hAnsi="Times New Roman"/>
+          <w:color w:val="000000"/>
+        </w:rPr>
+        <w:t>What is already known</w:t>
+      </w:r>
+    </w:p>
+    <w:p>
+      <w:pPr>
+        <w:spacing w:line="480" w:lineRule="auto"/>
+      </w:pPr>
+      <w:r>
+        <w:rPr>
+          <w:rFonts w:ascii="Times New Roman" w:hAnsi="Times New Roman"/>
+          <w:b w:val="0"/>
+          <w:i w:val="0"/>
+          <w:sz w:val="24"/>
+        </w:rPr>
+        <w:t>• Meta-analysis heterogeneity is assessed using I-squared and tau-squared, which capture statistical variability across studies.</w:t>
+      </w:r>
+    </w:p>
+    <w:p>
+      <w:pPr>
+        <w:spacing w:line="480" w:lineRule="auto"/>
+      </w:pPr>
+      <w:r>
+        <w:rPr>
+          <w:rFonts w:ascii="Times New Roman" w:hAnsi="Times New Roman"/>
+          <w:b w:val="0"/>
+          <w:i w:val="0"/>
+          <w:sz w:val="24"/>
+        </w:rPr>
+        <w:t>• Sources of heterogeneity are typically categorized as clinical, methodological, or statistical diversity.</w:t>
+      </w:r>
+    </w:p>
+    <w:p>
+      <w:pPr>
+        <w:spacing w:line="480" w:lineRule="auto"/>
+      </w:pPr>
+      <w:r>
+        <w:rPr>
+          <w:rFonts w:ascii="Times New Roman" w:hAnsi="Times New Roman"/>
+          <w:b w:val="0"/>
+          <w:i w:val="0"/>
+          <w:sz w:val="24"/>
+        </w:rPr>
+        <w:t>• Differences in the number and type of variables collected across RCTs are acknowledged but not formally quantified in current meta-analytic practice.</w:t>
+      </w:r>
+    </w:p>
+    <w:p>
+      <w:pPr>
+        <w:spacing w:line="480" w:lineRule="auto"/>
+      </w:pPr>
+      <w:r>
+        <w:rPr>
+          <w:rFonts w:ascii="Times New Roman" w:hAnsi="Times New Roman"/>
+          <w:b w:val="0"/>
+          <w:i w:val="0"/>
+          <w:sz w:val="24"/>
+        </w:rPr>
+      </w:r>
+    </w:p>
+    <w:p>
+      <w:pPr>
+        <w:pStyle w:val="Heading2"/>
+      </w:pPr>
+      <w:r>
+        <w:rPr>
+          <w:rFonts w:ascii="Times New Roman" w:hAnsi="Times New Roman"/>
+          <w:color w:val="000000"/>
+        </w:rPr>
+        <w:t>What is new</w:t>
+      </w:r>
+    </w:p>
+    <w:p>
+      <w:pPr>
+        <w:spacing w:line="480" w:lineRule="auto"/>
+      </w:pPr>
+      <w:r>
+        <w:rPr>
+          <w:rFonts w:ascii="Times New Roman" w:hAnsi="Times New Roman"/>
+          <w:b w:val="0"/>
+          <w:i w:val="0"/>
+          <w:sz w:val="24"/>
+        </w:rPr>
+        <w:t>• We propose the Information Contribution Ratio (ICR), a measure of how much of a study's total data information is captured by its endpoint, computable from published Table 1 summary statistics.</w:t>
+      </w:r>
+    </w:p>
+    <w:p>
+      <w:pPr>
+        <w:spacing w:line="480" w:lineRule="auto"/>
+      </w:pPr>
+      <w:r>
+        <w:rPr>
+          <w:rFonts w:ascii="Times New Roman" w:hAnsi="Times New Roman"/>
+          <w:b w:val="0"/>
+          <w:i w:val="0"/>
+          <w:sz w:val="24"/>
+        </w:rPr>
+        <w:t>• We introduce a PCA-based ICR approach for individual patient data that captures the full covariance structure of the endpoint within each study.</w:t>
+      </w:r>
+    </w:p>
+    <w:p>
+      <w:pPr>
+        <w:spacing w:line="480" w:lineRule="auto"/>
+      </w:pPr>
+      <w:r>
+        <w:rPr>
+          <w:rFonts w:ascii="Times New Roman" w:hAnsi="Times New Roman"/>
+          <w:b w:val="0"/>
+          <w:i w:val="0"/>
+          <w:sz w:val="24"/>
+        </w:rPr>
+        <w:t>• The Prism Forest Plot extends the standard forest plot by encoding ICR as color and point-size dimensions, making structural heterogeneity immediately visible.</w:t>
+      </w:r>
+    </w:p>
+    <w:p>
+      <w:pPr>
+        <w:spacing w:line="480" w:lineRule="auto"/>
+      </w:pPr>
+      <w:r>
+        <w:rPr>
+          <w:rFonts w:ascii="Times New Roman" w:hAnsi="Times New Roman"/>
+          <w:b w:val="0"/>
+          <w:i w:val="0"/>
+          <w:sz w:val="24"/>
+        </w:rPr>
+      </w:r>
+    </w:p>
+    <w:p>
+      <w:pPr>
+        <w:pStyle w:val="Heading2"/>
+      </w:pPr>
+      <w:r>
+        <w:rPr>
+          <w:rFonts w:ascii="Times New Roman" w:hAnsi="Times New Roman"/>
+          <w:color w:val="000000"/>
+        </w:rPr>
+        <w:t>Potential impact for RSM readers outside the authors' field</w:t>
+      </w:r>
+    </w:p>
+    <w:p>
+      <w:pPr>
+        <w:spacing w:line="480" w:lineRule="auto"/>
+      </w:pPr>
+      <w:r>
+        <w:rPr>
+          <w:rFonts w:ascii="Times New Roman" w:hAnsi="Times New Roman"/>
+          <w:b w:val="0"/>
+          <w:i w:val="0"/>
+          <w:sz w:val="24"/>
+        </w:rPr>
+        <w:t>• Meta-analysts across all disciplines can retrospectively compute ICR for any published RCT using Table 1 data, without requiring individual patient data or additional statistical software.</w:t>
+      </w:r>
+    </w:p>
+    <w:p>
+      <w:pPr>
+        <w:spacing w:line="480" w:lineRule="auto"/>
+      </w:pPr>
+      <w:r>
+        <w:rPr>
+          <w:rFonts w:ascii="Times New Roman" w:hAnsi="Times New Roman"/>
+          <w:b w:val="0"/>
+          <w:i w:val="0"/>
+          <w:sz w:val="24"/>
+        </w:rPr>
+        <w:t>• The Prism Forest Plot offers an intuitive visual diagnostic that can be adopted in any systematic review to reveal whether studies being pooled have comparable informational structures.</w:t>
+      </w:r>
+    </w:p>
+    <w:p>
+      <w:pPr>
+        <w:spacing w:line="480" w:lineRule="auto"/>
+      </w:pPr>
+      <w:r>
+        <w:rPr>
+          <w:rFonts w:ascii="Times New Roman" w:hAnsi="Times New Roman"/>
+          <w:b w:val="0"/>
+          <w:i w:val="0"/>
+          <w:sz w:val="24"/>
+        </w:rPr>
+        <w:t>• ICR discrepancy provides a new criterion for assessing study comparability in evidence synthesis guidelines, potentially informing GRADE certainty assessments and Cochrane review protocols.</w:t>
       </w:r>
     </w:p>
     <w:p>

</xml_diff>

<commit_message>
Reformat manuscript and DOCX for BMC Medical Research Methodology; add BMC MRM cover letter
Co-Authored-By: Tatsuki Onishi <bougtoir@gmail.com>
</commit_message>
<xml_diff>
--- a/icr_paper/ICR_paper_english.docx
+++ b/icr_paper/ICR_paper_english.docx
@@ -49,21 +49,6 @@
     <w:p>
       <w:pPr>
         <w:spacing w:line="480" w:lineRule="auto"/>
-        <w:jc w:val="center"/>
-      </w:pPr>
-      <w:r>
-        <w:rPr>
-          <w:rFonts w:ascii="Times New Roman" w:hAnsi="Times New Roman"/>
-          <w:b w:val="0"/>
-          <w:i/>
-          <w:sz w:val="24"/>
-        </w:rPr>
-        <w:t>Running head: LINKO: Information Contribution Ratio for Meta-Analysis Validity</w:t>
-      </w:r>
-    </w:p>
-    <w:p>
-      <w:pPr>
-        <w:spacing w:line="480" w:lineRule="auto"/>
       </w:pPr>
       <w:r>
         <w:rPr>
@@ -86,7 +71,7 @@
           <w:i w:val="0"/>
           <w:sz w:val="24"/>
         </w:rPr>
-        <w:t>Tatsuki Onishi [ORCID: https://orcid.org/XXXX-XXXX-XXXX-XXXX]</w:t>
+        <w:t>Tatsuki Onishi</w:t>
       </w:r>
     </w:p>
     <w:p>
@@ -129,7 +114,7 @@
           <w:i w:val="0"/>
           <w:sz w:val="24"/>
         </w:rPr>
-        <w:t>Corresponding author: Tatsuki Onishi, [Email], ORCID: https://orcid.org/XXXX-XXXX-XXXX-XXXX</w:t>
+        <w:t>Corresponding author: Tatsuki Onishi, [Email]</w:t>
       </w:r>
     </w:p>
     <w:p>
@@ -147,26 +132,6 @@
           <w:color w:val="000000"/>
         </w:rPr>
         <w:t>Abstract</w:t>
-      </w:r>
-    </w:p>
-    <w:p>
-      <w:pPr>
-        <w:spacing w:line="480" w:lineRule="auto"/>
-      </w:pPr>
-      <w:r>
-        <w:rPr>
-          <w:rFonts w:ascii="Times New Roman" w:hAnsi="Times New Roman"/>
-          <w:b/>
-          <w:sz w:val="24"/>
-        </w:rPr>
-        <w:t xml:space="preserve">Aim(s): </w:t>
-      </w:r>
-      <w:r>
-        <w:rPr>
-          <w:rFonts w:ascii="Times New Roman" w:hAnsi="Times New Roman"/>
-          <w:sz w:val="24"/>
-        </w:rPr>
-        <w:t>We introduce the LINKO (Latent Information Normalization for Key Outcomes) framework, proposing the Information Contribution Ratio (ICR) as a diagnostic measure for assessing whether endpoint variables carry equivalent informational weight across studies in a meta-analysis.</w:t>
       </w:r>
     </w:p>
     <w:p>
@@ -186,7 +151,7 @@
           <w:rFonts w:ascii="Times New Roman" w:hAnsi="Times New Roman"/>
           <w:sz w:val="24"/>
         </w:rPr>
-        <w:t>Meta-analysis pools effect sizes from multiple RCTs, but each RCT collects different numbers of variables, meaning the endpoint may represent vastly different proportions of the total information space. This structural heterogeneity is not captured by I-squared or tau-squared.</w:t>
+        <w:t>Meta-analysis pools effect sizes from multiple RCTs, but each RCT collects different numbers of variables, meaning the endpoint may represent vastly different proportions of the total information space. This structural heterogeneity is not captured by I-squared or tau-squared. We introduce the LINKO (Latent Information Normalization for Key Outcomes) framework, proposing the Information Contribution Ratio (ICR) as a diagnostic measure for assessing whether endpoint variables carry equivalent informational weight across studies in a meta-analysis.</w:t>
       </w:r>
     </w:p>
     <w:p>
@@ -270,233 +235,20 @@
       </w:r>
     </w:p>
     <w:p>
-      <w:pPr>
-        <w:spacing w:line="480" w:lineRule="auto"/>
-      </w:pPr>
-      <w:r>
-        <w:rPr>
-          <w:rFonts w:ascii="Times New Roman" w:hAnsi="Times New Roman"/>
-          <w:b/>
-          <w:sz w:val="24"/>
-        </w:rPr>
-        <w:t xml:space="preserve">Research Synthesis Keywords: </w:t>
-      </w:r>
-      <w:r>
-        <w:rPr>
-          <w:rFonts w:ascii="Times New Roman" w:hAnsi="Times New Roman"/>
-          <w:sz w:val="24"/>
-        </w:rPr>
-        <w:t>meta-analysis heterogeneity diagnostics; structural heterogeneity; individual participant data synthesis; novel visualization methods; simulation study</w:t>
-      </w:r>
-    </w:p>
-    <w:p>
       <w:r>
         <w:br w:type="page"/>
       </w:r>
     </w:p>
     <w:p>
       <w:pPr>
-        <w:pStyle w:val="Heading2"/>
+        <w:pStyle w:val="Heading1"/>
       </w:pPr>
       <w:r>
         <w:rPr>
           <w:rFonts w:ascii="Times New Roman" w:hAnsi="Times New Roman"/>
           <w:color w:val="000000"/>
         </w:rPr>
-        <w:t>What is already known</w:t>
-      </w:r>
-    </w:p>
-    <w:p>
-      <w:pPr>
-        <w:spacing w:line="480" w:lineRule="auto"/>
-      </w:pPr>
-      <w:r>
-        <w:rPr>
-          <w:rFonts w:ascii="Times New Roman" w:hAnsi="Times New Roman"/>
-          <w:b w:val="0"/>
-          <w:i w:val="0"/>
-          <w:sz w:val="24"/>
-        </w:rPr>
-        <w:t>• Meta-analysis heterogeneity is assessed using I-squared and tau-squared, which capture statistical variability across studies.</w:t>
-      </w:r>
-    </w:p>
-    <w:p>
-      <w:pPr>
-        <w:spacing w:line="480" w:lineRule="auto"/>
-      </w:pPr>
-      <w:r>
-        <w:rPr>
-          <w:rFonts w:ascii="Times New Roman" w:hAnsi="Times New Roman"/>
-          <w:b w:val="0"/>
-          <w:i w:val="0"/>
-          <w:sz w:val="24"/>
-        </w:rPr>
-        <w:t>• Sources of heterogeneity are typically categorized as clinical, methodological, or statistical diversity.</w:t>
-      </w:r>
-    </w:p>
-    <w:p>
-      <w:pPr>
-        <w:spacing w:line="480" w:lineRule="auto"/>
-      </w:pPr>
-      <w:r>
-        <w:rPr>
-          <w:rFonts w:ascii="Times New Roman" w:hAnsi="Times New Roman"/>
-          <w:b w:val="0"/>
-          <w:i w:val="0"/>
-          <w:sz w:val="24"/>
-        </w:rPr>
-        <w:t>• Differences in the number and type of variables collected across RCTs are acknowledged but not formally quantified in current meta-analytic practice.</w:t>
-      </w:r>
-    </w:p>
-    <w:p>
-      <w:pPr>
-        <w:spacing w:line="480" w:lineRule="auto"/>
-      </w:pPr>
-      <w:r>
-        <w:rPr>
-          <w:rFonts w:ascii="Times New Roman" w:hAnsi="Times New Roman"/>
-          <w:b w:val="0"/>
-          <w:i w:val="0"/>
-          <w:sz w:val="24"/>
-        </w:rPr>
-      </w:r>
-    </w:p>
-    <w:p>
-      <w:pPr>
-        <w:pStyle w:val="Heading2"/>
-      </w:pPr>
-      <w:r>
-        <w:rPr>
-          <w:rFonts w:ascii="Times New Roman" w:hAnsi="Times New Roman"/>
-          <w:color w:val="000000"/>
-        </w:rPr>
-        <w:t>What is new</w:t>
-      </w:r>
-    </w:p>
-    <w:p>
-      <w:pPr>
-        <w:spacing w:line="480" w:lineRule="auto"/>
-      </w:pPr>
-      <w:r>
-        <w:rPr>
-          <w:rFonts w:ascii="Times New Roman" w:hAnsi="Times New Roman"/>
-          <w:b w:val="0"/>
-          <w:i w:val="0"/>
-          <w:sz w:val="24"/>
-        </w:rPr>
-        <w:t>• We propose the Information Contribution Ratio (ICR), a measure of how much of a study's total data information is captured by its endpoint, computable from published Table 1 summary statistics.</w:t>
-      </w:r>
-    </w:p>
-    <w:p>
-      <w:pPr>
-        <w:spacing w:line="480" w:lineRule="auto"/>
-      </w:pPr>
-      <w:r>
-        <w:rPr>
-          <w:rFonts w:ascii="Times New Roman" w:hAnsi="Times New Roman"/>
-          <w:b w:val="0"/>
-          <w:i w:val="0"/>
-          <w:sz w:val="24"/>
-        </w:rPr>
-        <w:t>• We introduce a PCA-based ICR approach for individual patient data that captures the full covariance structure of the endpoint within each study.</w:t>
-      </w:r>
-    </w:p>
-    <w:p>
-      <w:pPr>
-        <w:spacing w:line="480" w:lineRule="auto"/>
-      </w:pPr>
-      <w:r>
-        <w:rPr>
-          <w:rFonts w:ascii="Times New Roman" w:hAnsi="Times New Roman"/>
-          <w:b w:val="0"/>
-          <w:i w:val="0"/>
-          <w:sz w:val="24"/>
-        </w:rPr>
-        <w:t>• The Prism Forest Plot extends the standard forest plot by encoding ICR as color and point-size dimensions, making structural heterogeneity immediately visible.</w:t>
-      </w:r>
-    </w:p>
-    <w:p>
-      <w:pPr>
-        <w:spacing w:line="480" w:lineRule="auto"/>
-      </w:pPr>
-      <w:r>
-        <w:rPr>
-          <w:rFonts w:ascii="Times New Roman" w:hAnsi="Times New Roman"/>
-          <w:b w:val="0"/>
-          <w:i w:val="0"/>
-          <w:sz w:val="24"/>
-        </w:rPr>
-      </w:r>
-    </w:p>
-    <w:p>
-      <w:pPr>
-        <w:pStyle w:val="Heading2"/>
-      </w:pPr>
-      <w:r>
-        <w:rPr>
-          <w:rFonts w:ascii="Times New Roman" w:hAnsi="Times New Roman"/>
-          <w:color w:val="000000"/>
-        </w:rPr>
-        <w:t>Potential impact for RSM readers outside the authors' field</w:t>
-      </w:r>
-    </w:p>
-    <w:p>
-      <w:pPr>
-        <w:spacing w:line="480" w:lineRule="auto"/>
-      </w:pPr>
-      <w:r>
-        <w:rPr>
-          <w:rFonts w:ascii="Times New Roman" w:hAnsi="Times New Roman"/>
-          <w:b w:val="0"/>
-          <w:i w:val="0"/>
-          <w:sz w:val="24"/>
-        </w:rPr>
-        <w:t>• Meta-analysts across all disciplines can retrospectively compute ICR for any published RCT using Table 1 data, without requiring individual patient data or additional statistical software.</w:t>
-      </w:r>
-    </w:p>
-    <w:p>
-      <w:pPr>
-        <w:spacing w:line="480" w:lineRule="auto"/>
-      </w:pPr>
-      <w:r>
-        <w:rPr>
-          <w:rFonts w:ascii="Times New Roman" w:hAnsi="Times New Roman"/>
-          <w:b w:val="0"/>
-          <w:i w:val="0"/>
-          <w:sz w:val="24"/>
-        </w:rPr>
-        <w:t>• The Prism Forest Plot offers an intuitive visual diagnostic that can be adopted in any systematic review to reveal whether studies being pooled have comparable informational structures.</w:t>
-      </w:r>
-    </w:p>
-    <w:p>
-      <w:pPr>
-        <w:spacing w:line="480" w:lineRule="auto"/>
-      </w:pPr>
-      <w:r>
-        <w:rPr>
-          <w:rFonts w:ascii="Times New Roman" w:hAnsi="Times New Roman"/>
-          <w:b w:val="0"/>
-          <w:i w:val="0"/>
-          <w:sz w:val="24"/>
-        </w:rPr>
-        <w:t>• ICR discrepancy provides a new criterion for assessing study comparability in evidence synthesis guidelines, potentially informing GRADE certainty assessments and Cochrane review protocols.</w:t>
-      </w:r>
-    </w:p>
-    <w:p>
-      <w:r>
-        <w:br w:type="page"/>
-      </w:r>
-    </w:p>
-    <w:p>
-      <w:pPr>
-        <w:pStyle w:val="Heading1"/>
-      </w:pPr>
-      <w:r>
-        <w:rPr>
-          <w:rFonts w:ascii="Times New Roman" w:hAnsi="Times New Roman"/>
-          <w:color w:val="000000"/>
-        </w:rPr>
-        <w:t>Introduction</w:t>
+        <w:t>Background</w:t>
       </w:r>
     </w:p>
     <w:p>
@@ -6209,7 +5961,7 @@
           <w:rFonts w:ascii="Times New Roman" w:hAnsi="Times New Roman"/>
           <w:color w:val="000000"/>
         </w:rPr>
-        <w:t>Data Availability Statement</w:t>
+        <w:t>Availability of data and materials</w:t>
       </w:r>
     </w:p>
     <w:p>
@@ -6235,7 +5987,7 @@
           <w:rFonts w:ascii="Times New Roman" w:hAnsi="Times New Roman"/>
           <w:color w:val="000000"/>
         </w:rPr>
-        <w:t>Competing Interests</w:t>
+        <w:t>Competing interests</w:t>
       </w:r>
     </w:p>
     <w:p>
@@ -6249,7 +6001,7 @@
           <w:i w:val="0"/>
           <w:sz w:val="24"/>
         </w:rPr>
-        <w:t>The authors declare no competing interests.</w:t>
+        <w:t>The authors declare that they have no competing interests.</w:t>
       </w:r>
     </w:p>
     <w:p>
@@ -6287,7 +6039,7 @@
           <w:rFonts w:ascii="Times New Roman" w:hAnsi="Times New Roman"/>
           <w:color w:val="000000"/>
         </w:rPr>
-        <w:t>Authors' Contributions (CRediT Taxonomy)</w:t>
+        <w:t>Authors' contributions</w:t>
       </w:r>
     </w:p>
     <w:p>
@@ -6301,7 +6053,7 @@
           <w:i w:val="0"/>
           <w:sz w:val="24"/>
         </w:rPr>
-        <w:t>[To be completed. Example: Conceptualization: T.O.; Methodology: T.O.; Software: T.O.; Formal analysis: T.O.; Writing - original draft: T.O.; Writing - review &amp; editing: T.O.]</w:t>
+        <w:t>[To be completed]</w:t>
       </w:r>
     </w:p>
     <w:p>

</xml_diff>